<commit_message>
feat: introduce TestigentAI V6 enterprise quality platform
</commit_message>
<xml_diff>
--- a/docs/TestigentAI_Issue_Challenge_Solution_Log.docx
+++ b/docs/TestigentAI_Issue_Challenge_Solution_Log.docx
@@ -61,6 +61,7 @@
       </w:tblGrid>
       <w:tr>
         <w:trPr>
+          <w:cantSplit/>
           <w:cantSplit/>
         </w:trPr>
         <w:tc>
@@ -117,6 +118,7 @@
       <w:tr>
         <w:trPr>
           <w:cantSplit/>
+          <w:cantSplit/>
         </w:trPr>
         <w:tc>
           <w:tcPr>
@@ -171,6 +173,7 @@
       </w:tr>
       <w:tr>
         <w:trPr>
+          <w:cantSplit/>
           <w:cantSplit/>
         </w:trPr>
         <w:tc>
@@ -227,6 +230,7 @@
       <w:tr>
         <w:trPr>
           <w:cantSplit/>
+          <w:cantSplit/>
         </w:trPr>
         <w:tc>
           <w:tcPr>
@@ -374,6 +378,7 @@
       <w:tr>
         <w:trPr>
           <w:tblHeader w:val="true"/>
+          <w:cantSplit/>
           <w:cantSplit/>
         </w:trPr>
         <w:tc>
@@ -430,6 +435,7 @@
       </w:tr>
       <w:tr>
         <w:trPr>
+          <w:cantSplit/>
           <w:cantSplit/>
         </w:trPr>
         <w:tc>
@@ -505,6 +511,7 @@
       <w:tr>
         <w:trPr>
           <w:cantSplit/>
+          <w:cantSplit/>
         </w:trPr>
         <w:tc>
           <w:tcPr>
@@ -578,6 +585,7 @@
       </w:tr>
       <w:tr>
         <w:trPr>
+          <w:cantSplit/>
           <w:cantSplit/>
         </w:trPr>
         <w:tc>
@@ -653,6 +661,7 @@
       <w:tr>
         <w:trPr>
           <w:cantSplit/>
+          <w:cantSplit/>
         </w:trPr>
         <w:tc>
           <w:tcPr>
@@ -727,6 +736,7 @@
       <w:tr>
         <w:trPr>
           <w:cantSplit/>
+          <w:cantSplit/>
         </w:trPr>
         <w:tc>
           <w:tcPr>
@@ -823,6 +833,7 @@
       <w:tr>
         <w:trPr>
           <w:tblHeader w:val="true"/>
+          <w:cantSplit/>
           <w:cantSplit/>
         </w:trPr>
         <w:tc>
@@ -896,6 +907,7 @@
       </w:tr>
       <w:tr>
         <w:trPr>
+          <w:cantSplit/>
           <w:cantSplit/>
         </w:trPr>
         <w:tc>
@@ -999,6 +1011,7 @@
       <w:tr>
         <w:trPr>
           <w:cantSplit/>
+          <w:cantSplit/>
         </w:trPr>
         <w:tc>
           <w:tcPr>
@@ -1100,6 +1113,7 @@
       </w:tr>
       <w:tr>
         <w:trPr>
+          <w:cantSplit/>
           <w:cantSplit/>
         </w:trPr>
         <w:tc>
@@ -1203,6 +1217,7 @@
       <w:tr>
         <w:trPr>
           <w:cantSplit/>
+          <w:cantSplit/>
         </w:trPr>
         <w:tc>
           <w:tcPr>
@@ -1304,6 +1319,7 @@
       </w:tr>
       <w:tr>
         <w:trPr>
+          <w:cantSplit/>
           <w:cantSplit/>
         </w:trPr>
         <w:tc>
@@ -1407,6 +1423,7 @@
       <w:tr>
         <w:trPr>
           <w:cantSplit/>
+          <w:cantSplit/>
         </w:trPr>
         <w:tc>
           <w:tcPr>
@@ -1508,6 +1525,7 @@
       </w:tr>
       <w:tr>
         <w:trPr>
+          <w:cantSplit/>
           <w:cantSplit/>
         </w:trPr>
         <w:tc>
@@ -1611,6 +1629,7 @@
       <w:tr>
         <w:trPr>
           <w:cantSplit/>
+          <w:cantSplit/>
         </w:trPr>
         <w:tc>
           <w:tcPr>
@@ -1712,6 +1731,7 @@
       </w:tr>
       <w:tr>
         <w:trPr>
+          <w:cantSplit/>
           <w:cantSplit/>
         </w:trPr>
         <w:tc>
@@ -1815,6 +1835,7 @@
       <w:tr>
         <w:trPr>
           <w:cantSplit/>
+          <w:cantSplit/>
         </w:trPr>
         <w:tc>
           <w:tcPr>
@@ -1916,6 +1937,7 @@
       </w:tr>
       <w:tr>
         <w:trPr>
+          <w:cantSplit/>
           <w:cantSplit/>
         </w:trPr>
         <w:tc>
@@ -2019,6 +2041,7 @@
       <w:tr>
         <w:trPr>
           <w:cantSplit/>
+          <w:cantSplit/>
         </w:trPr>
         <w:tc>
           <w:tcPr>
@@ -2120,6 +2143,7 @@
       </w:tr>
       <w:tr>
         <w:trPr>
+          <w:cantSplit/>
           <w:cantSplit/>
         </w:trPr>
         <w:tc>
@@ -2223,6 +2247,7 @@
       <w:tr>
         <w:trPr>
           <w:cantSplit/>
+          <w:cantSplit/>
         </w:trPr>
         <w:tc>
           <w:tcPr>
@@ -2325,6 +2350,7 @@
       <w:tr>
         <w:trPr>
           <w:cantSplit/>
+          <w:cantSplit/>
         </w:trPr>
         <w:tc>
           <w:tcPr>
@@ -2411,21 +2437,15 @@
             <w:shd w:fill="FFF2CC"/>
           </w:tcPr>
           <w:p>
-            <w:pPr>
-              <w:spacing w:after="0" w:before="0" w:line="240" w:lineRule="auto"/>
-            </w:pPr>
             <w:r>
-              <w:rPr>
-                <w:rFonts w:ascii="Aptos" w:hAnsi="Aptos"/>
-                <w:sz w:val="18"/>
-              </w:rPr>
-              <w:t>WORKAROUND / FOLLOW-UP</w:t>
+              <w:t>RESOLVED V6</w:t>
             </w:r>
           </w:p>
         </w:tc>
       </w:tr>
       <w:tr>
         <w:trPr>
+          <w:cantSplit/>
           <w:cantSplit/>
         </w:trPr>
         <w:tc>
@@ -2529,6 +2549,7 @@
       <w:tr>
         <w:trPr>
           <w:cantSplit/>
+          <w:cantSplit/>
         </w:trPr>
         <w:tc>
           <w:tcPr>
@@ -2631,6 +2652,7 @@
       <w:tr>
         <w:trPr>
           <w:cantSplit/>
+          <w:cantSplit/>
         </w:trPr>
         <w:tc>
           <w:tcPr>
@@ -4205,13 +4227,7 @@
     </w:p>
     <w:p>
       <w:r>
-        <w:rPr>
-          <w:rFonts w:ascii="Aptos" w:hAnsi="Aptos"/>
-          <w:b/>
-          <w:color w:val="2F5597"/>
-          <w:sz w:val="18"/>
-        </w:rPr>
-        <w:t>Area: Fixture architecture    Status: WORKAROUND / FOLLOW-UP</w:t>
+        <w:t>Area: Fixture architecture    Status: RESOLVED V6</w:t>
       </w:r>
     </w:p>
     <w:p>
@@ -4247,13 +4263,7 @@
         <w:spacing w:after="60" w:before="0" w:line="259" w:lineRule="auto"/>
       </w:pPr>
       <w:r>
-        <w:rPr>
-          <w:b/>
-        </w:rPr>
-        <w:t xml:space="preserve">Solution: </w:t>
-      </w:r>
-      <w:r>
-        <w:t>Current workaround: generate auth state with app:auth. Recommended architectural improvement: decouple @db-only tests from UI storage-state requirements.</w:t>
+        <w:t>Solution: Refactored project preflight to be capability-aware. API/DB/AI-only lanes do not require browser storage state; UI/E2E/visual/accessibility/performance lanes still fail fast when project policy requires authenticated browser state.</w:t>
       </w:r>
     </w:p>
     <w:p>
@@ -4272,7 +4282,13 @@
         <w:pStyle w:val="CodeBlock"/>
       </w:pPr>
       <w:r>
-        <w:t>APP=sdet-practice ENV=qa APPLICATION_EXPLORATION_ENABLED=true npm run app:auth</w:t>
+        <w:t>APP=sdet-practice ENV=qa TEST_LANE=db npm run project:check</w:t>
+        <w:br/>
+        <w:t># DB preflight proceeds without UI storage state.</w:t>
+        <w:br/>
+        <w:t>APP=sdet-practice ENV=qa TEST_LANE=ui npm run project:check</w:t>
+        <w:br/>
+        <w:t># UI preflight fails fast when required storage state is absent.</w:t>
       </w:r>
     </w:p>
     <w:p>
@@ -4294,13 +4310,7 @@
         <w:spacing w:after="140" w:before="0" w:line="259" w:lineRule="auto"/>
       </w:pPr>
       <w:r>
-        <w:rPr>
-          <w:b/>
-        </w:rPr>
-        <w:t xml:space="preserve">Follow-up: </w:t>
-      </w:r>
-      <w:r>
-        <w:t>Refactor project bootstrap so auth is required only by UI/E2E capabilities that need it.</w:t>
+        <w:t>Follow-up: Closed in V6. Keep capability-auth behavior covered by framework contract tests and project preflight validation.</w:t>
       </w:r>
     </w:p>
     <w:p>
@@ -4895,6 +4905,7 @@
       </w:tblGrid>
       <w:tr>
         <w:trPr>
+          <w:cantSplit/>
           <w:cantSplit/>
         </w:trPr>
         <w:tc>
@@ -4943,6 +4954,7 @@
       <w:tr>
         <w:trPr>
           <w:cantSplit/>
+          <w:cantSplit/>
         </w:trPr>
         <w:tc>
           <w:tcPr>
@@ -4989,6 +5001,7 @@
       </w:tr>
       <w:tr>
         <w:trPr>
+          <w:cantSplit/>
           <w:cantSplit/>
         </w:trPr>
         <w:tc>
@@ -5037,6 +5050,7 @@
       <w:tr>
         <w:trPr>
           <w:cantSplit/>
+          <w:cantSplit/>
         </w:trPr>
         <w:tc>
           <w:tcPr>
@@ -5083,6 +5097,7 @@
       </w:tr>
       <w:tr>
         <w:trPr>
+          <w:cantSplit/>
           <w:cantSplit/>
         </w:trPr>
         <w:tc>
@@ -5131,6 +5146,7 @@
       <w:tr>
         <w:trPr>
           <w:cantSplit/>
+          <w:cantSplit/>
         </w:trPr>
         <w:tc>
           <w:tcPr>
@@ -5177,6 +5193,7 @@
       </w:tr>
       <w:tr>
         <w:trPr>
+          <w:cantSplit/>
           <w:cantSplit/>
         </w:trPr>
         <w:tc>
@@ -5225,6 +5242,7 @@
       <w:tr>
         <w:trPr>
           <w:cantSplit/>
+          <w:cantSplit/>
         </w:trPr>
         <w:tc>
           <w:tcPr>
@@ -5354,6 +5372,2232 @@
           <w:sz w:val="18"/>
         </w:rPr>
         <w:t>End of current record - append new entries rather than creating separate troubleshooting documents.</w:t>
+      </w:r>
+    </w:p>
+    <w:p>
+      <w:r>
+        <w:br w:type="page"/>
+      </w:r>
+    </w:p>
+    <w:p>
+      <w:pPr>
+        <w:pStyle w:val="Heading1"/>
+      </w:pPr>
+      <w:r>
+        <w:t>8. V6 Scale, Product and Market Challenges</w:t>
+      </w:r>
+    </w:p>
+    <w:p>
+      <w:r>
+        <w:t>Updated: 11 September 2026. These records capture the product-level issues discovered during the V6 architecture and 2026 market review. Each entry separates symptom, root cause, solution, verification and the engineering lesson so future teams do not repeat the same design mistakes.</w:t>
+      </w:r>
+    </w:p>
+    <w:tbl>
+      <w:tblPr>
+        <w:tblStyle w:val="TableGrid"/>
+        <w:tblW w:type="auto" w:w="0"/>
+        <w:jc w:val="center"/>
+        <w:tblLook w:firstColumn="1" w:firstRow="1" w:lastColumn="0" w:lastRow="0" w:noHBand="0" w:noVBand="1" w:val="04A0"/>
+      </w:tblPr>
+      <w:tblGrid>
+        <w:gridCol w:w="2556"/>
+        <w:gridCol w:w="2556"/>
+        <w:gridCol w:w="2556"/>
+        <w:gridCol w:w="2556"/>
+      </w:tblGrid>
+      <w:tr>
+        <w:trPr>
+          <w:tblHeader w:val="true"/>
+          <w:cantSplit/>
+          <w:cantSplit/>
+        </w:trPr>
+        <w:tc>
+          <w:tcPr>
+            <w:tcW w:type="dxa" w:w="2556"/>
+          </w:tcPr>
+          <w:p>
+            <w:r>
+              <w:rPr>
+                <w:sz w:val="16"/>
+              </w:rPr>
+              <w:t>ID</w:t>
+            </w:r>
+          </w:p>
+        </w:tc>
+        <w:tc>
+          <w:tcPr>
+            <w:tcW w:type="dxa" w:w="2556"/>
+          </w:tcPr>
+          <w:p>
+            <w:r>
+              <w:rPr>
+                <w:sz w:val="16"/>
+              </w:rPr>
+              <w:t>Area</w:t>
+            </w:r>
+          </w:p>
+        </w:tc>
+        <w:tc>
+          <w:tcPr>
+            <w:tcW w:type="dxa" w:w="2556"/>
+          </w:tcPr>
+          <w:p>
+            <w:r>
+              <w:rPr>
+                <w:sz w:val="16"/>
+              </w:rPr>
+              <w:t>Challenge</w:t>
+            </w:r>
+          </w:p>
+        </w:tc>
+        <w:tc>
+          <w:tcPr>
+            <w:tcW w:type="dxa" w:w="2556"/>
+          </w:tcPr>
+          <w:p>
+            <w:r>
+              <w:rPr>
+                <w:sz w:val="16"/>
+              </w:rPr>
+              <w:t>Status</w:t>
+            </w:r>
+          </w:p>
+        </w:tc>
+      </w:tr>
+      <w:tr>
+        <w:trPr>
+          <w:cantSplit/>
+          <w:cantSplit/>
+        </w:trPr>
+        <w:tc>
+          <w:tcPr>
+            <w:tcW w:type="dxa" w:w="2556"/>
+            <w:vAlign w:val="top"/>
+          </w:tcPr>
+          <w:p>
+            <w:r>
+              <w:rPr>
+                <w:sz w:val="16"/>
+              </w:rPr>
+              <w:t>TIG-018</w:t>
+            </w:r>
+          </w:p>
+        </w:tc>
+        <w:tc>
+          <w:tcPr>
+            <w:tcW w:type="dxa" w:w="2556"/>
+            <w:vAlign w:val="top"/>
+          </w:tcPr>
+          <w:p>
+            <w:r>
+              <w:rPr>
+                <w:sz w:val="16"/>
+              </w:rPr>
+              <w:t>Execution policy</w:t>
+            </w:r>
+          </w:p>
+        </w:tc>
+        <w:tc>
+          <w:tcPr>
+            <w:tcW w:type="dxa" w:w="2556"/>
+            <w:vAlign w:val="top"/>
+          </w:tcPr>
+          <w:p>
+            <w:r>
+              <w:rPr>
+                <w:sz w:val="16"/>
+              </w:rPr>
+              <w:t>PW_WORKERS=50% was converted through Number(...) and became NaN.</w:t>
+            </w:r>
+          </w:p>
+        </w:tc>
+        <w:tc>
+          <w:tcPr>
+            <w:tcW w:type="dxa" w:w="2556"/>
+            <w:vAlign w:val="top"/>
+          </w:tcPr>
+          <w:p>
+            <w:r>
+              <w:rPr>
+                <w:sz w:val="16"/>
+              </w:rPr>
+              <w:t>RESOLVED V6</w:t>
+            </w:r>
+          </w:p>
+        </w:tc>
+      </w:tr>
+      <w:tr>
+        <w:trPr>
+          <w:cantSplit/>
+          <w:cantSplit/>
+        </w:trPr>
+        <w:tc>
+          <w:tcPr>
+            <w:tcW w:type="dxa" w:w="2556"/>
+            <w:vAlign w:val="top"/>
+          </w:tcPr>
+          <w:p>
+            <w:r>
+              <w:rPr>
+                <w:sz w:val="16"/>
+              </w:rPr>
+              <w:t>TIG-019</w:t>
+            </w:r>
+          </w:p>
+        </w:tc>
+        <w:tc>
+          <w:tcPr>
+            <w:tcW w:type="dxa" w:w="2556"/>
+            <w:vAlign w:val="top"/>
+          </w:tcPr>
+          <w:p>
+            <w:r>
+              <w:rPr>
+                <w:sz w:val="16"/>
+              </w:rPr>
+              <w:t>Auth / capability isolation</w:t>
+            </w:r>
+          </w:p>
+        </w:tc>
+        <w:tc>
+          <w:tcPr>
+            <w:tcW w:type="dxa" w:w="2556"/>
+            <w:vAlign w:val="top"/>
+          </w:tcPr>
+          <w:p>
+            <w:r>
+              <w:rPr>
+                <w:sz w:val="16"/>
+              </w:rPr>
+              <w:t>DB/API-only execution could be blocked by missing browser storage state.</w:t>
+            </w:r>
+          </w:p>
+        </w:tc>
+        <w:tc>
+          <w:tcPr>
+            <w:tcW w:type="dxa" w:w="2556"/>
+            <w:vAlign w:val="top"/>
+          </w:tcPr>
+          <w:p>
+            <w:r>
+              <w:rPr>
+                <w:sz w:val="16"/>
+              </w:rPr>
+              <w:t>RESOLVED V6</w:t>
+            </w:r>
+          </w:p>
+        </w:tc>
+      </w:tr>
+      <w:tr>
+        <w:trPr>
+          <w:cantSplit/>
+          <w:cantSplit/>
+        </w:trPr>
+        <w:tc>
+          <w:tcPr>
+            <w:tcW w:type="dxa" w:w="2556"/>
+            <w:vAlign w:val="top"/>
+          </w:tcPr>
+          <w:p>
+            <w:r>
+              <w:rPr>
+                <w:sz w:val="16"/>
+              </w:rPr>
+              <w:t>TIG-020</w:t>
+            </w:r>
+          </w:p>
+        </w:tc>
+        <w:tc>
+          <w:tcPr>
+            <w:tcW w:type="dxa" w:w="2556"/>
+            <w:vAlign w:val="top"/>
+          </w:tcPr>
+          <w:p>
+            <w:r>
+              <w:rPr>
+                <w:sz w:val="16"/>
+              </w:rPr>
+              <w:t>Parallel test data</w:t>
+            </w:r>
+          </w:p>
+        </w:tc>
+        <w:tc>
+          <w:tcPr>
+            <w:tcW w:type="dxa" w:w="2556"/>
+            <w:vAlign w:val="top"/>
+          </w:tcPr>
+          <w:p>
+            <w:r>
+              <w:rPr>
+                <w:sz w:val="16"/>
+              </w:rPr>
+              <w:t>Workers could collide on the same mutable user/order/data record.</w:t>
+            </w:r>
+          </w:p>
+        </w:tc>
+        <w:tc>
+          <w:tcPr>
+            <w:tcW w:type="dxa" w:w="2556"/>
+            <w:vAlign w:val="top"/>
+          </w:tcPr>
+          <w:p>
+            <w:r>
+              <w:rPr>
+                <w:sz w:val="16"/>
+              </w:rPr>
+              <w:t>RESOLVED V6</w:t>
+            </w:r>
+          </w:p>
+        </w:tc>
+      </w:tr>
+      <w:tr>
+        <w:trPr>
+          <w:cantSplit/>
+          <w:cantSplit/>
+        </w:trPr>
+        <w:tc>
+          <w:tcPr>
+            <w:tcW w:type="dxa" w:w="2556"/>
+            <w:vAlign w:val="top"/>
+          </w:tcPr>
+          <w:p>
+            <w:r>
+              <w:rPr>
+                <w:sz w:val="16"/>
+              </w:rPr>
+              <w:t>TIG-021</w:t>
+            </w:r>
+          </w:p>
+        </w:tc>
+        <w:tc>
+          <w:tcPr>
+            <w:tcW w:type="dxa" w:w="2556"/>
+            <w:vAlign w:val="top"/>
+          </w:tcPr>
+          <w:p>
+            <w:r>
+              <w:rPr>
+                <w:sz w:val="16"/>
+              </w:rPr>
+              <w:t>Data-driven authoring</w:t>
+            </w:r>
+          </w:p>
+        </w:tc>
+        <w:tc>
+          <w:tcPr>
+            <w:tcW w:type="dxa" w:w="2556"/>
+            <w:vAlign w:val="top"/>
+          </w:tcPr>
+          <w:p>
+            <w:r>
+              <w:rPr>
+                <w:sz w:val="16"/>
+              </w:rPr>
+              <w:t>Large datasets risked loops inside one Playwright test and duplicate case IDs.</w:t>
+            </w:r>
+          </w:p>
+        </w:tc>
+        <w:tc>
+          <w:tcPr>
+            <w:tcW w:type="dxa" w:w="2556"/>
+            <w:vAlign w:val="top"/>
+          </w:tcPr>
+          <w:p>
+            <w:r>
+              <w:rPr>
+                <w:sz w:val="16"/>
+              </w:rPr>
+              <w:t>RESOLVED V6</w:t>
+            </w:r>
+          </w:p>
+        </w:tc>
+      </w:tr>
+      <w:tr>
+        <w:trPr>
+          <w:cantSplit/>
+          <w:cantSplit/>
+        </w:trPr>
+        <w:tc>
+          <w:tcPr>
+            <w:tcW w:type="dxa" w:w="2556"/>
+            <w:vAlign w:val="top"/>
+          </w:tcPr>
+          <w:p>
+            <w:r>
+              <w:rPr>
+                <w:sz w:val="16"/>
+              </w:rPr>
+              <w:t>TIG-022</w:t>
+            </w:r>
+          </w:p>
+        </w:tc>
+        <w:tc>
+          <w:tcPr>
+            <w:tcW w:type="dxa" w:w="2556"/>
+            <w:vAlign w:val="top"/>
+          </w:tcPr>
+          <w:p>
+            <w:r>
+              <w:rPr>
+                <w:sz w:val="16"/>
+              </w:rPr>
+              <w:t>Execution balancing</w:t>
+            </w:r>
+          </w:p>
+        </w:tc>
+        <w:tc>
+          <w:tcPr>
+            <w:tcW w:type="dxa" w:w="2556"/>
+            <w:vAlign w:val="top"/>
+          </w:tcPr>
+          <w:p>
+            <w:r>
+              <w:rPr>
+                <w:sz w:val="16"/>
+              </w:rPr>
+              <w:t>Custom scheduling risked replacing Playwright with a fragile scheduler and duration history could become inefficient.</w:t>
+            </w:r>
+          </w:p>
+        </w:tc>
+        <w:tc>
+          <w:tcPr>
+            <w:tcW w:type="dxa" w:w="2556"/>
+            <w:vAlign w:val="top"/>
+          </w:tcPr>
+          <w:p>
+            <w:r>
+              <w:rPr>
+                <w:sz w:val="16"/>
+              </w:rPr>
+              <w:t>RESOLVED V6</w:t>
+            </w:r>
+          </w:p>
+        </w:tc>
+      </w:tr>
+      <w:tr>
+        <w:trPr>
+          <w:cantSplit/>
+          <w:cantSplit/>
+        </w:trPr>
+        <w:tc>
+          <w:tcPr>
+            <w:tcW w:type="dxa" w:w="2556"/>
+            <w:vAlign w:val="top"/>
+          </w:tcPr>
+          <w:p>
+            <w:r>
+              <w:rPr>
+                <w:sz w:val="16"/>
+              </w:rPr>
+              <w:t>TIG-023</w:t>
+            </w:r>
+          </w:p>
+        </w:tc>
+        <w:tc>
+          <w:tcPr>
+            <w:tcW w:type="dxa" w:w="2556"/>
+            <w:vAlign w:val="top"/>
+          </w:tcPr>
+          <w:p>
+            <w:r>
+              <w:rPr>
+                <w:sz w:val="16"/>
+              </w:rPr>
+              <w:t>AI/generated governance</w:t>
+            </w:r>
+          </w:p>
+        </w:tc>
+        <w:tc>
+          <w:tcPr>
+            <w:tcW w:type="dxa" w:w="2556"/>
+            <w:vAlign w:val="top"/>
+          </w:tcPr>
+          <w:p>
+            <w:r>
+              <w:rPr>
+                <w:sz w:val="16"/>
+              </w:rPr>
+              <w:t>A custom profile could accidentally inherit permission to run AI, generated or manual-only tests.</w:t>
+            </w:r>
+          </w:p>
+        </w:tc>
+        <w:tc>
+          <w:tcPr>
+            <w:tcW w:type="dxa" w:w="2556"/>
+            <w:vAlign w:val="top"/>
+          </w:tcPr>
+          <w:p>
+            <w:r>
+              <w:rPr>
+                <w:sz w:val="16"/>
+              </w:rPr>
+              <w:t>RESOLVED V6</w:t>
+            </w:r>
+          </w:p>
+        </w:tc>
+      </w:tr>
+      <w:tr>
+        <w:trPr>
+          <w:cantSplit/>
+          <w:cantSplit/>
+        </w:trPr>
+        <w:tc>
+          <w:tcPr>
+            <w:tcW w:type="dxa" w:w="2556"/>
+            <w:vAlign w:val="top"/>
+          </w:tcPr>
+          <w:p>
+            <w:r>
+              <w:rPr>
+                <w:sz w:val="16"/>
+              </w:rPr>
+              <w:t>TIG-024</w:t>
+            </w:r>
+          </w:p>
+        </w:tc>
+        <w:tc>
+          <w:tcPr>
+            <w:tcW w:type="dxa" w:w="2556"/>
+            <w:vAlign w:val="top"/>
+          </w:tcPr>
+          <w:p>
+            <w:r>
+              <w:rPr>
+                <w:sz w:val="16"/>
+              </w:rPr>
+              <w:t>Configuration precedence</w:t>
+            </w:r>
+          </w:p>
+        </w:tc>
+        <w:tc>
+          <w:tcPr>
+            <w:tcW w:type="dxa" w:w="2556"/>
+            <w:vAlign w:val="top"/>
+          </w:tcPr>
+          <w:p>
+            <w:r>
+              <w:rPr>
+                <w:sz w:val="16"/>
+              </w:rPr>
+              <w:t>Multiple teams need org, project, environment and runtime flexibility without unclear override behavior.</w:t>
+            </w:r>
+          </w:p>
+        </w:tc>
+        <w:tc>
+          <w:tcPr>
+            <w:tcW w:type="dxa" w:w="2556"/>
+            <w:vAlign w:val="top"/>
+          </w:tcPr>
+          <w:p>
+            <w:r>
+              <w:rPr>
+                <w:sz w:val="16"/>
+              </w:rPr>
+              <w:t>RESOLVED V6</w:t>
+            </w:r>
+          </w:p>
+        </w:tc>
+      </w:tr>
+      <w:tr>
+        <w:trPr>
+          <w:cantSplit/>
+          <w:cantSplit/>
+        </w:trPr>
+        <w:tc>
+          <w:tcPr>
+            <w:tcW w:type="dxa" w:w="2556"/>
+            <w:vAlign w:val="top"/>
+          </w:tcPr>
+          <w:p>
+            <w:r>
+              <w:rPr>
+                <w:sz w:val="16"/>
+              </w:rPr>
+              <w:t>TIG-025</w:t>
+            </w:r>
+          </w:p>
+        </w:tc>
+        <w:tc>
+          <w:tcPr>
+            <w:tcW w:type="dxa" w:w="2556"/>
+            <w:vAlign w:val="top"/>
+          </w:tcPr>
+          <w:p>
+            <w:r>
+              <w:rPr>
+                <w:sz w:val="16"/>
+              </w:rPr>
+              <w:t>Provider lock-in / tool sprawl</w:t>
+            </w:r>
+          </w:p>
+        </w:tc>
+        <w:tc>
+          <w:tcPr>
+            <w:tcW w:type="dxa" w:w="2556"/>
+            <w:vAlign w:val="top"/>
+          </w:tcPr>
+          <w:p>
+            <w:r>
+              <w:rPr>
+                <w:sz w:val="16"/>
+              </w:rPr>
+              <w:t>Market platforms combine device clouds, AI agents, visual, accessibility and management, encouraging proprietary coupling.</w:t>
+            </w:r>
+          </w:p>
+        </w:tc>
+        <w:tc>
+          <w:tcPr>
+            <w:tcW w:type="dxa" w:w="2556"/>
+            <w:vAlign w:val="top"/>
+          </w:tcPr>
+          <w:p>
+            <w:r>
+              <w:rPr>
+                <w:sz w:val="16"/>
+              </w:rPr>
+              <w:t>ARCHITECTURE DECISION</w:t>
+            </w:r>
+          </w:p>
+        </w:tc>
+      </w:tr>
+      <w:tr>
+        <w:trPr>
+          <w:cantSplit/>
+          <w:cantSplit/>
+        </w:trPr>
+        <w:tc>
+          <w:tcPr>
+            <w:tcW w:type="dxa" w:w="2556"/>
+            <w:vAlign w:val="top"/>
+          </w:tcPr>
+          <w:p>
+            <w:r>
+              <w:rPr>
+                <w:sz w:val="16"/>
+              </w:rPr>
+              <w:t>TIG-026</w:t>
+            </w:r>
+          </w:p>
+        </w:tc>
+        <w:tc>
+          <w:tcPr>
+            <w:tcW w:type="dxa" w:w="2556"/>
+            <w:vAlign w:val="top"/>
+          </w:tcPr>
+          <w:p>
+            <w:r>
+              <w:rPr>
+                <w:sz w:val="16"/>
+              </w:rPr>
+              <w:t>Accessibility</w:t>
+            </w:r>
+          </w:p>
+        </w:tc>
+        <w:tc>
+          <w:tcPr>
+            <w:tcW w:type="dxa" w:w="2556"/>
+            <w:vAlign w:val="top"/>
+          </w:tcPr>
+          <w:p>
+            <w:r>
+              <w:rPr>
+                <w:sz w:val="16"/>
+              </w:rPr>
+              <w:t>Simple DOM checks could be mistaken for full WCAG compliance.</w:t>
+            </w:r>
+          </w:p>
+        </w:tc>
+        <w:tc>
+          <w:tcPr>
+            <w:tcW w:type="dxa" w:w="2556"/>
+            <w:vAlign w:val="top"/>
+          </w:tcPr>
+          <w:p>
+            <w:r>
+              <w:rPr>
+                <w:sz w:val="16"/>
+              </w:rPr>
+              <w:t>RESOLVED V6 / BOUNDED</w:t>
+            </w:r>
+          </w:p>
+        </w:tc>
+      </w:tr>
+      <w:tr>
+        <w:trPr>
+          <w:cantSplit/>
+          <w:cantSplit/>
+        </w:trPr>
+        <w:tc>
+          <w:tcPr>
+            <w:tcW w:type="dxa" w:w="2556"/>
+            <w:vAlign w:val="top"/>
+          </w:tcPr>
+          <w:p>
+            <w:r>
+              <w:rPr>
+                <w:sz w:val="16"/>
+              </w:rPr>
+              <w:t>TIG-027</w:t>
+            </w:r>
+          </w:p>
+        </w:tc>
+        <w:tc>
+          <w:tcPr>
+            <w:tcW w:type="dxa" w:w="2556"/>
+            <w:vAlign w:val="top"/>
+          </w:tcPr>
+          <w:p>
+            <w:r>
+              <w:rPr>
+                <w:sz w:val="16"/>
+              </w:rPr>
+              <w:t>Declarative authoring security</w:t>
+            </w:r>
+          </w:p>
+        </w:tc>
+        <w:tc>
+          <w:tcPr>
+            <w:tcW w:type="dxa" w:w="2556"/>
+            <w:vAlign w:val="top"/>
+          </w:tcPr>
+          <w:p>
+            <w:r>
+              <w:rPr>
+                <w:sz w:val="16"/>
+              </w:rPr>
+              <w:t>Natural-language/YAML authoring can become arbitrary code or shell execution if the DSL is too permissive.</w:t>
+            </w:r>
+          </w:p>
+        </w:tc>
+        <w:tc>
+          <w:tcPr>
+            <w:tcW w:type="dxa" w:w="2556"/>
+            <w:vAlign w:val="top"/>
+          </w:tcPr>
+          <w:p>
+            <w:r>
+              <w:rPr>
+                <w:sz w:val="16"/>
+              </w:rPr>
+              <w:t>RESOLVED V6</w:t>
+            </w:r>
+          </w:p>
+        </w:tc>
+      </w:tr>
+      <w:tr>
+        <w:trPr>
+          <w:cantSplit/>
+          <w:cantSplit/>
+        </w:trPr>
+        <w:tc>
+          <w:tcPr>
+            <w:tcW w:type="dxa" w:w="2556"/>
+            <w:vAlign w:val="top"/>
+          </w:tcPr>
+          <w:p>
+            <w:r>
+              <w:rPr>
+                <w:sz w:val="16"/>
+              </w:rPr>
+              <w:t>TIG-028</w:t>
+            </w:r>
+          </w:p>
+        </w:tc>
+        <w:tc>
+          <w:tcPr>
+            <w:tcW w:type="dxa" w:w="2556"/>
+            <w:vAlign w:val="top"/>
+          </w:tcPr>
+          <w:p>
+            <w:r>
+              <w:rPr>
+                <w:sz w:val="16"/>
+              </w:rPr>
+              <w:t>Product claims</w:t>
+            </w:r>
+          </w:p>
+        </w:tc>
+        <w:tc>
+          <w:tcPr>
+            <w:tcW w:type="dxa" w:w="2556"/>
+            <w:vAlign w:val="top"/>
+          </w:tcPr>
+          <w:p>
+            <w:r>
+              <w:rPr>
+                <w:sz w:val="16"/>
+              </w:rPr>
+              <w:t>"No tool can compete" is not an engineering fact without comparative evidence.</w:t>
+            </w:r>
+          </w:p>
+        </w:tc>
+        <w:tc>
+          <w:tcPr>
+            <w:tcW w:type="dxa" w:w="2556"/>
+            <w:vAlign w:val="top"/>
+          </w:tcPr>
+          <w:p>
+            <w:r>
+              <w:rPr>
+                <w:sz w:val="16"/>
+              </w:rPr>
+              <w:t>RESOLVED AS PRODUCT POLICY</w:t>
+            </w:r>
+          </w:p>
+        </w:tc>
+      </w:tr>
+      <w:tr>
+        <w:trPr>
+          <w:cantSplit/>
+          <w:cantSplit/>
+        </w:trPr>
+        <w:tc>
+          <w:tcPr>
+            <w:tcW w:type="dxa" w:w="2556"/>
+            <w:vAlign w:val="top"/>
+          </w:tcPr>
+          <w:p>
+            <w:r>
+              <w:rPr>
+                <w:sz w:val="16"/>
+              </w:rPr>
+              <w:t>TIG-029</w:t>
+            </w:r>
+          </w:p>
+        </w:tc>
+        <w:tc>
+          <w:tcPr>
+            <w:tcW w:type="dxa" w:w="2556"/>
+            <w:vAlign w:val="top"/>
+          </w:tcPr>
+          <w:p>
+            <w:r>
+              <w:rPr>
+                <w:sz w:val="16"/>
+              </w:rPr>
+              <w:t>AI/agent evaluation</w:t>
+            </w:r>
+          </w:p>
+        </w:tc>
+        <w:tc>
+          <w:tcPr>
+            <w:tcW w:type="dxa" w:w="2556"/>
+            <w:vAlign w:val="top"/>
+          </w:tcPr>
+          <w:p>
+            <w:r>
+              <w:rPr>
+                <w:sz w:val="16"/>
+              </w:rPr>
+              <w:t>UI automation alone does not validate RAG/agent reasoning, tools, arguments or task completion.</w:t>
+            </w:r>
+          </w:p>
+        </w:tc>
+        <w:tc>
+          <w:tcPr>
+            <w:tcW w:type="dxa" w:w="2556"/>
+            <w:vAlign w:val="top"/>
+          </w:tcPr>
+          <w:p>
+            <w:r>
+              <w:rPr>
+                <w:sz w:val="16"/>
+              </w:rPr>
+              <w:t>RESOLVED V6 FOUNDATION</w:t>
+            </w:r>
+          </w:p>
+        </w:tc>
+      </w:tr>
+      <w:tr>
+        <w:trPr>
+          <w:cantSplit/>
+          <w:cantSplit/>
+        </w:trPr>
+        <w:tc>
+          <w:tcPr>
+            <w:tcW w:type="dxa" w:w="2556"/>
+            <w:vAlign w:val="top"/>
+          </w:tcPr>
+          <w:p>
+            <w:r>
+              <w:rPr>
+                <w:sz w:val="16"/>
+              </w:rPr>
+              <w:t>TIG-030</w:t>
+            </w:r>
+          </w:p>
+        </w:tc>
+        <w:tc>
+          <w:tcPr>
+            <w:tcW w:type="dxa" w:w="2556"/>
+            <w:vAlign w:val="top"/>
+          </w:tcPr>
+          <w:p>
+            <w:r>
+              <w:rPr>
+                <w:sz w:val="16"/>
+              </w:rPr>
+              <w:t>Dependency reproducibility</w:t>
+            </w:r>
+          </w:p>
+        </w:tc>
+        <w:tc>
+          <w:tcPr>
+            <w:tcW w:type="dxa" w:w="2556"/>
+            <w:vAlign w:val="top"/>
+          </w:tcPr>
+          <w:p>
+            <w:r>
+              <w:rPr>
+                <w:sz w:val="16"/>
+              </w:rPr>
+              <w:t>Floating latest dependency ranges could change framework behavior between installs.</w:t>
+            </w:r>
+          </w:p>
+        </w:tc>
+        <w:tc>
+          <w:tcPr>
+            <w:tcW w:type="dxa" w:w="2556"/>
+            <w:vAlign w:val="top"/>
+          </w:tcPr>
+          <w:p>
+            <w:r>
+              <w:rPr>
+                <w:sz w:val="16"/>
+              </w:rPr>
+              <w:t>RESOLVED V6</w:t>
+            </w:r>
+          </w:p>
+        </w:tc>
+      </w:tr>
+      <w:tr>
+        <w:trPr>
+          <w:cantSplit/>
+        </w:trPr>
+        <w:tc>
+          <w:tcPr>
+            <w:tcW w:type="dxa" w:w="2556"/>
+          </w:tcPr>
+          <w:p>
+            <w:r>
+              <w:rPr>
+                <w:sz w:val="16"/>
+              </w:rPr>
+              <w:t>TIG-031</w:t>
+            </w:r>
+          </w:p>
+        </w:tc>
+        <w:tc>
+          <w:tcPr>
+            <w:tcW w:type="dxa" w:w="2556"/>
+          </w:tcPr>
+          <w:p>
+            <w:r>
+              <w:rPr>
+                <w:sz w:val="16"/>
+              </w:rPr>
+              <w:t>Execution governance</w:t>
+            </w:r>
+          </w:p>
+        </w:tc>
+        <w:tc>
+          <w:tcPr>
+            <w:tcW w:type="dxa" w:w="2556"/>
+          </w:tcPr>
+          <w:p>
+            <w:r>
+              <w:rPr>
+                <w:sz w:val="16"/>
+              </w:rPr>
+              <w:t>CLI --grep / --grep-invert could override profile/lane policy and re-enable excluded suites.</w:t>
+            </w:r>
+          </w:p>
+        </w:tc>
+        <w:tc>
+          <w:tcPr>
+            <w:tcW w:type="dxa" w:w="2556"/>
+          </w:tcPr>
+          <w:p>
+            <w:r>
+              <w:rPr>
+                <w:sz w:val="16"/>
+              </w:rPr>
+              <w:t>RESOLVED V6 FINAL</w:t>
+            </w:r>
+          </w:p>
+        </w:tc>
+      </w:tr>
+      <w:tr>
+        <w:trPr>
+          <w:cantSplit/>
+        </w:trPr>
+        <w:tc>
+          <w:tcPr>
+            <w:tcW w:type="dxa" w:w="2556"/>
+          </w:tcPr>
+          <w:p>
+            <w:r>
+              <w:rPr>
+                <w:sz w:val="16"/>
+              </w:rPr>
+              <w:t>TIG-032</w:t>
+            </w:r>
+          </w:p>
+        </w:tc>
+        <w:tc>
+          <w:tcPr>
+            <w:tcW w:type="dxa" w:w="2556"/>
+          </w:tcPr>
+          <w:p>
+            <w:r>
+              <w:rPr>
+                <w:sz w:val="16"/>
+              </w:rPr>
+              <w:t>Parallel data identity</w:t>
+            </w:r>
+          </w:p>
+        </w:tc>
+        <w:tc>
+          <w:tcPr>
+            <w:tcW w:type="dxa" w:w="2556"/>
+          </w:tcPr>
+          <w:p>
+            <w:r>
+              <w:rPr>
+                <w:sz w:val="16"/>
+              </w:rPr>
+              <w:t>Case ID annotation timing and missing environment scope could weaken ownership uniqueness.</w:t>
+            </w:r>
+          </w:p>
+        </w:tc>
+        <w:tc>
+          <w:tcPr>
+            <w:tcW w:type="dxa" w:w="2556"/>
+          </w:tcPr>
+          <w:p>
+            <w:r>
+              <w:rPr>
+                <w:sz w:val="16"/>
+              </w:rPr>
+              <w:t>RESOLVED V6 FINAL</w:t>
+            </w:r>
+          </w:p>
+        </w:tc>
+      </w:tr>
+      <w:tr>
+        <w:trPr>
+          <w:cantSplit/>
+        </w:trPr>
+        <w:tc>
+          <w:tcPr>
+            <w:tcW w:type="dxa" w:w="2556"/>
+          </w:tcPr>
+          <w:p>
+            <w:r>
+              <w:rPr>
+                <w:sz w:val="16"/>
+              </w:rPr>
+              <w:t>TIG-033</w:t>
+            </w:r>
+          </w:p>
+        </w:tc>
+        <w:tc>
+          <w:tcPr>
+            <w:tcW w:type="dxa" w:w="2556"/>
+          </w:tcPr>
+          <w:p>
+            <w:r>
+              <w:rPr>
+                <w:sz w:val="16"/>
+              </w:rPr>
+              <w:t>Duration history</w:t>
+            </w:r>
+          </w:p>
+        </w:tc>
+        <w:tc>
+          <w:tcPr>
+            <w:tcW w:type="dxa" w:w="2556"/>
+          </w:tcPr>
+          <w:p>
+            <w:r>
+              <w:rPr>
+                <w:sz w:val="16"/>
+              </w:rPr>
+              <w:t>Corrupt/negative duration estimates could poison history-based shard planning.</w:t>
+            </w:r>
+          </w:p>
+        </w:tc>
+        <w:tc>
+          <w:tcPr>
+            <w:tcW w:type="dxa" w:w="2556"/>
+          </w:tcPr>
+          <w:p>
+            <w:r>
+              <w:rPr>
+                <w:sz w:val="16"/>
+              </w:rPr>
+              <w:t>RESOLVED V6 FINAL</w:t>
+            </w:r>
+          </w:p>
+        </w:tc>
+      </w:tr>
+      <w:tr>
+        <w:trPr>
+          <w:cantSplit/>
+        </w:trPr>
+        <w:tc>
+          <w:tcPr>
+            <w:tcW w:type="dxa" w:w="2556"/>
+          </w:tcPr>
+          <w:p>
+            <w:r>
+              <w:rPr>
+                <w:sz w:val="16"/>
+              </w:rPr>
+              <w:t>TIG-034</w:t>
+            </w:r>
+          </w:p>
+        </w:tc>
+        <w:tc>
+          <w:tcPr>
+            <w:tcW w:type="dxa" w:w="2556"/>
+          </w:tcPr>
+          <w:p>
+            <w:r>
+              <w:rPr>
+                <w:sz w:val="16"/>
+              </w:rPr>
+              <w:t>Release assurance</w:t>
+            </w:r>
+          </w:p>
+        </w:tc>
+        <w:tc>
+          <w:tcPr>
+            <w:tcW w:type="dxa" w:w="2556"/>
+          </w:tcPr>
+          <w:p>
+            <w:r>
+              <w:rPr>
+                <w:sz w:val="16"/>
+              </w:rPr>
+              <w:t>A market-ready framework needed dependency-independent release checks, SBOM and repeatable verification.</w:t>
+            </w:r>
+          </w:p>
+        </w:tc>
+        <w:tc>
+          <w:tcPr>
+            <w:tcW w:type="dxa" w:w="2556"/>
+          </w:tcPr>
+          <w:p>
+            <w:r>
+              <w:rPr>
+                <w:sz w:val="16"/>
+              </w:rPr>
+              <w:t>RESOLVED V6 FINAL</w:t>
+            </w:r>
+          </w:p>
+        </w:tc>
+      </w:tr>
+      <w:tr>
+        <w:trPr>
+          <w:cantSplit/>
+        </w:trPr>
+        <w:tc>
+          <w:tcPr>
+            <w:tcW w:type="dxa" w:w="2556"/>
+          </w:tcPr>
+          <w:p>
+            <w:r>
+              <w:t>TIG-035</w:t>
+            </w:r>
+          </w:p>
+        </w:tc>
+        <w:tc>
+          <w:tcPr>
+            <w:tcW w:type="dxa" w:w="2556"/>
+          </w:tcPr>
+          <w:p>
+            <w:r>
+              <w:t>Release typing</w:t>
+            </w:r>
+          </w:p>
+        </w:tc>
+        <w:tc>
+          <w:tcPr>
+            <w:tcW w:type="dxa" w:w="2556"/>
+          </w:tcPr>
+          <w:p>
+            <w:r>
+              <w:t>Runner indexed an optional ExecutionPolicyInput parameter type and failed clean TypeScript validation.</w:t>
+            </w:r>
+          </w:p>
+        </w:tc>
+        <w:tc>
+          <w:tcPr>
+            <w:tcW w:type="dxa" w:w="2556"/>
+          </w:tcPr>
+          <w:p>
+            <w:r>
+              <w:t>RESOLVED v1.1.1</w:t>
+            </w:r>
+          </w:p>
+        </w:tc>
+      </w:tr>
+      <w:tr>
+        <w:trPr>
+          <w:cantSplit/>
+        </w:trPr>
+        <w:tc>
+          <w:tcPr>
+            <w:tcW w:type="dxa" w:w="2556"/>
+          </w:tcPr>
+          <w:p>
+            <w:r>
+              <w:t>TIG-036</w:t>
+            </w:r>
+          </w:p>
+        </w:tc>
+        <w:tc>
+          <w:tcPr>
+            <w:tcW w:type="dxa" w:w="2556"/>
+          </w:tcPr>
+          <w:p>
+            <w:r>
+              <w:t>CLI / scale audit</w:t>
+            </w:r>
+          </w:p>
+        </w:tc>
+        <w:tc>
+          <w:tcPr>
+            <w:tcW w:type="dxa" w:w="2556"/>
+          </w:tcPr>
+          <w:p>
+            <w:r>
+              <w:t>Intuitive comments:audit command was missing and pure @data spec produced misleading lane warning.</w:t>
+            </w:r>
+          </w:p>
+        </w:tc>
+        <w:tc>
+          <w:tcPr>
+            <w:tcW w:type="dxa" w:w="2556"/>
+          </w:tcPr>
+          <w:p>
+            <w:r>
+              <w:t>RESOLVED v1.1.2</w:t>
+            </w:r>
+          </w:p>
+        </w:tc>
+      </w:tr>
+    </w:tbl>
+    <w:p>
+      <w:pPr>
+        <w:pStyle w:val="Heading2"/>
+      </w:pPr>
+      <w:r>
+        <w:t>TIG-018 - PW_WORKERS=50% was converted through Number(...) and became NaN.</w:t>
+      </w:r>
+    </w:p>
+    <w:p>
+      <w:r>
+        <w:rPr>
+          <w:b/>
+        </w:rPr>
+        <w:t xml:space="preserve">Area / status: </w:t>
+      </w:r>
+      <w:r>
+        <w:t>Execution policy | RESOLVED V6</w:t>
+      </w:r>
+    </w:p>
+    <w:p>
+      <w:r>
+        <w:rPr>
+          <w:b/>
+        </w:rPr>
+        <w:t xml:space="preserve">Root cause: </w:t>
+      </w:r>
+      <w:r>
+        <w:t>The previous config assumed workers were integers even though Playwright accepts percentage worker settings.</w:t>
+      </w:r>
+    </w:p>
+    <w:p>
+      <w:r>
+        <w:rPr>
+          <w:b/>
+        </w:rPr>
+        <w:t xml:space="preserve">Solution: </w:t>
+      </w:r>
+      <w:r>
+        <w:t>Created a typed WorkerSetting parser and centralized execution policy so integer and percentage workers are validated consistently.</w:t>
+      </w:r>
+    </w:p>
+    <w:p>
+      <w:r>
+        <w:rPr>
+          <w:b/>
+        </w:rPr>
+        <w:t xml:space="preserve">Verification: </w:t>
+      </w:r>
+      <w:r>
+        <w:t>Validate parseWorkers("50%") and resolve profiles through the V6 execution contract tests.</w:t>
+      </w:r>
+    </w:p>
+    <w:p>
+      <w:r>
+        <w:rPr>
+          <w:b/>
+        </w:rPr>
+        <w:t xml:space="preserve">Lesson learned: </w:t>
+      </w:r>
+      <w:r>
+        <w:t>Framework configuration must preserve native engine capabilities instead of narrowing them accidentally.</w:t>
+      </w:r>
+    </w:p>
+    <w:p>
+      <w:pPr>
+        <w:pStyle w:val="Heading2"/>
+      </w:pPr>
+      <w:r>
+        <w:t>TIG-019 - DB/API-only execution could be blocked by missing browser storage state.</w:t>
+      </w:r>
+    </w:p>
+    <w:p>
+      <w:r>
+        <w:rPr>
+          <w:b/>
+        </w:rPr>
+        <w:t xml:space="preserve">Area / status: </w:t>
+      </w:r>
+      <w:r>
+        <w:t>Auth / capability isolation | RESOLVED V6</w:t>
+      </w:r>
+    </w:p>
+    <w:p>
+      <w:r>
+        <w:rPr>
+          <w:b/>
+        </w:rPr>
+        <w:t xml:space="preserve">Root cause: </w:t>
+      </w:r>
+      <w:r>
+        <w:t>Project preflight treated authentication as a project-wide requirement instead of a capability requirement.</w:t>
+      </w:r>
+    </w:p>
+    <w:p>
+      <w:r>
+        <w:rPr>
+          <w:b/>
+        </w:rPr>
+        <w:t xml:space="preserve">Solution: </w:t>
+      </w:r>
+      <w:r>
+        <w:t>Authentication preflight is now lane-aware. UI/E2E/browser lanes enforce required storage state; API/DB-only lanes do not.</w:t>
+      </w:r>
+    </w:p>
+    <w:p>
+      <w:r>
+        <w:rPr>
+          <w:b/>
+        </w:rPr>
+        <w:t xml:space="preserve">Verification: </w:t>
+      </w:r>
+      <w:r>
+        <w:t>Run project preflight for db/api without storage state, then verify ui fails fast when the required state is missing.</w:t>
+      </w:r>
+    </w:p>
+    <w:p>
+      <w:r>
+        <w:rPr>
+          <w:b/>
+        </w:rPr>
+        <w:t xml:space="preserve">Lesson learned: </w:t>
+      </w:r>
+      <w:r>
+        <w:t>Resources should be required by the capability that consumes them, not by unrelated tests.</w:t>
+      </w:r>
+    </w:p>
+    <w:p>
+      <w:pPr>
+        <w:pStyle w:val="Heading2"/>
+      </w:pPr>
+      <w:r>
+        <w:t>TIG-020 - Workers could collide on the same mutable user/order/data record.</w:t>
+      </w:r>
+    </w:p>
+    <w:p>
+      <w:r>
+        <w:rPr>
+          <w:b/>
+        </w:rPr>
+        <w:t xml:space="preserve">Area / status: </w:t>
+      </w:r>
+      <w:r>
+        <w:t>Parallel test data | RESOLVED V6</w:t>
+      </w:r>
+    </w:p>
+    <w:p>
+      <w:r>
+        <w:rPr>
+          <w:b/>
+        </w:rPr>
+        <w:t xml:space="preserve">Root cause: </w:t>
+      </w:r>
+      <w:r>
+        <w:t>Parallelism without explicit ownership turns shared business identities into hidden global state.</w:t>
+      </w:r>
+    </w:p>
+    <w:p>
+      <w:r>
+        <w:rPr>
+          <w:b/>
+        </w:rPr>
+        <w:t xml:space="preserve">Solution: </w:t>
+      </w:r>
+      <w:r>
+        <w:t>Added dataScope identities for stable, retry-attempt and idempotent ownership. Tests can derive bounded names from run/test/worker identity.</w:t>
+      </w:r>
+    </w:p>
+    <w:p>
+      <w:r>
+        <w:rPr>
+          <w:b/>
+        </w:rPr>
+        <w:t xml:space="preserve">Verification: </w:t>
+      </w:r>
+      <w:r>
+        <w:t>V6 contract tests assert stable/attempt/idempotent behavior and scale audit reviews data-driven suites.</w:t>
+      </w:r>
+    </w:p>
+    <w:p>
+      <w:r>
+        <w:rPr>
+          <w:b/>
+        </w:rPr>
+        <w:t xml:space="preserve">Lesson learned: </w:t>
+      </w:r>
+      <w:r>
+        <w:t>Parallel execution is safe only when mutable state has clear ownership.</w:t>
+      </w:r>
+    </w:p>
+    <w:p>
+      <w:pPr>
+        <w:pStyle w:val="Heading2"/>
+      </w:pPr>
+      <w:r>
+        <w:t>TIG-021 - Large datasets risked loops inside one Playwright test and duplicate case IDs.</w:t>
+      </w:r>
+    </w:p>
+    <w:p>
+      <w:r>
+        <w:rPr>
+          <w:b/>
+        </w:rPr>
+        <w:t xml:space="preserve">Area / status: </w:t>
+      </w:r>
+      <w:r>
+        <w:t>Data-driven authoring | RESOLVED V6</w:t>
+      </w:r>
+    </w:p>
+    <w:p>
+      <w:r>
+        <w:rPr>
+          <w:b/>
+        </w:rPr>
+        <w:t xml:space="preserve">Root cause: </w:t>
+      </w:r>
+      <w:r>
+        <w:t>Runtime loops hide individual case identity from sharding, retries and reporting. Duplicate IDs make evidence ambiguous.</w:t>
+      </w:r>
+    </w:p>
+    <w:p>
+      <w:r>
+        <w:rPr>
+          <w:b/>
+        </w:rPr>
+        <w:t xml:space="preserve">Solution: </w:t>
+      </w:r>
+      <w:r>
+        <w:t>Added JSON/CSV/YAML/Excel loadCases/loadCasesSync, non-empty/duplicate caseId validation, and a one-row-per-test reference.</w:t>
+      </w:r>
+    </w:p>
+    <w:p>
+      <w:r>
+        <w:rPr>
+          <w:b/>
+        </w:rPr>
+        <w:t xml:space="preserve">Verification: </w:t>
+      </w:r>
+      <w:r>
+        <w:t>Use the data-driven demo and duplicate-ID unit contract; each case becomes a separate Playwright test.</w:t>
+      </w:r>
+    </w:p>
+    <w:p>
+      <w:r>
+        <w:rPr>
+          <w:b/>
+        </w:rPr>
+        <w:t xml:space="preserve">Lesson learned: </w:t>
+      </w:r>
+      <w:r>
+        <w:t>Parameterization architecture determines whether a 2,000-case suite can scale and remain diagnosable.</w:t>
+      </w:r>
+    </w:p>
+    <w:p>
+      <w:pPr>
+        <w:pStyle w:val="Heading2"/>
+      </w:pPr>
+      <w:r>
+        <w:t>TIG-022 - Custom scheduling risked replacing Playwright with a fragile scheduler and duration history could become inefficient.</w:t>
+      </w:r>
+    </w:p>
+    <w:p>
+      <w:r>
+        <w:rPr>
+          <w:b/>
+        </w:rPr>
+        <w:t xml:space="preserve">Area / status: </w:t>
+      </w:r>
+      <w:r>
+        <w:t>Execution balancing | RESOLVED V6</w:t>
+      </w:r>
+    </w:p>
+    <w:p>
+      <w:r>
+        <w:rPr>
+          <w:b/>
+        </w:rPr>
+        <w:t xml:space="preserve">Root cause: </w:t>
+      </w:r>
+      <w:r>
+        <w:t>Historical balancing is useful only when it stays optional and lookup/update cost is bounded.</w:t>
+      </w:r>
+    </w:p>
+    <w:p>
+      <w:r>
+        <w:rPr>
+          <w:b/>
+        </w:rPr>
+        <w:t xml:space="preserve">Solution: </w:t>
+      </w:r>
+      <w:r>
+        <w:t>Native --shard remains default. Added indexed duration history and opt-in LPT-style test-list planning with explicit best-effort warning.</w:t>
+      </w:r>
+    </w:p>
+    <w:p>
+      <w:r>
+        <w:rPr>
+          <w:b/>
+        </w:rPr>
+        <w:t xml:space="preserve">Verification: </w:t>
+      </w:r>
+      <w:r>
+        <w:t>Run execution:plan-duration separately and compare plan balance with native shard baselines.</w:t>
+      </w:r>
+    </w:p>
+    <w:p>
+      <w:r>
+        <w:rPr>
+          <w:b/>
+        </w:rPr>
+        <w:t xml:space="preserve">Lesson learned: </w:t>
+      </w:r>
+      <w:r>
+        <w:t>Enhance the native runner; do not fork its scheduling semantics without strong evidence.</w:t>
+      </w:r>
+    </w:p>
+    <w:p>
+      <w:pPr>
+        <w:pStyle w:val="Heading2"/>
+      </w:pPr>
+      <w:r>
+        <w:t>TIG-023 - A custom profile could accidentally inherit permission to run AI, generated or manual-only tests.</w:t>
+      </w:r>
+    </w:p>
+    <w:p>
+      <w:r>
+        <w:rPr>
+          <w:b/>
+        </w:rPr>
+        <w:t xml:space="preserve">Area / status: </w:t>
+      </w:r>
+      <w:r>
+        <w:t>AI/generated governance | RESOLVED V6</w:t>
+      </w:r>
+    </w:p>
+    <w:p>
+      <w:r>
+        <w:rPr>
+          <w:b/>
+        </w:rPr>
+        <w:t xml:space="preserve">Root cause: </w:t>
+      </w:r>
+      <w:r>
+        <w:t>Permissive flags can leak through layered configuration unless custom execution starts from a safe policy boundary.</w:t>
+      </w:r>
+    </w:p>
+    <w:p>
+      <w:r>
+        <w:rPr>
+          <w:b/>
+        </w:rPr>
+        <w:t xml:space="preserve">Solution: </w:t>
+      </w:r>
+      <w:r>
+        <w:t>Custom profile now safe-denies AI/generated/manual categories unless explicitly authorized at runtime/CLI.</w:t>
+      </w:r>
+    </w:p>
+    <w:p>
+      <w:r>
+        <w:rPr>
+          <w:b/>
+        </w:rPr>
+        <w:t xml:space="preserve">Verification: </w:t>
+      </w:r>
+      <w:r>
+        <w:t>V6 policy contract tests verify deny-by-default and explicit opt-in behavior.</w:t>
+      </w:r>
+    </w:p>
+    <w:p>
+      <w:r>
+        <w:rPr>
+          <w:b/>
+        </w:rPr>
+        <w:t xml:space="preserve">Lesson learned: </w:t>
+      </w:r>
+      <w:r>
+        <w:t>Flexible configuration needs safe defaults, especially for expensive or non-deterministic execution.</w:t>
+      </w:r>
+    </w:p>
+    <w:p>
+      <w:pPr>
+        <w:pStyle w:val="Heading2"/>
+      </w:pPr>
+      <w:r>
+        <w:t>TIG-024 - Multiple teams need org, project, environment and runtime flexibility without unclear override behavior.</w:t>
+      </w:r>
+    </w:p>
+    <w:p>
+      <w:r>
+        <w:rPr>
+          <w:b/>
+        </w:rPr>
+        <w:t xml:space="preserve">Area / status: </w:t>
+      </w:r>
+      <w:r>
+        <w:t>Configuration precedence | RESOLVED V6</w:t>
+      </w:r>
+    </w:p>
+    <w:p>
+      <w:r>
+        <w:rPr>
+          <w:b/>
+        </w:rPr>
+        <w:t xml:space="preserve">Root cause: </w:t>
+      </w:r>
+      <w:r>
+        <w:t>Scattered environment reads create implicit precedence and make executions hard to reproduce.</w:t>
+      </w:r>
+    </w:p>
+    <w:p>
+      <w:r>
+        <w:rPr>
+          <w:b/>
+        </w:rPr>
+        <w:t xml:space="preserve">Solution: </w:t>
+      </w:r>
+      <w:r>
+        <w:t>Centralized organization -&gt; project -&gt; environment -&gt; environment-variable -&gt; CLI resolution and records policy sources.</w:t>
+      </w:r>
+    </w:p>
+    <w:p>
+      <w:r>
+        <w:rPr>
+          <w:b/>
+        </w:rPr>
+        <w:t xml:space="preserve">Verification: </w:t>
+      </w:r>
+      <w:r>
+        <w:t>Resolve the same profile with controlled overrides and assert the resulting worker/retry/allow policy.</w:t>
+      </w:r>
+    </w:p>
+    <w:p>
+      <w:r>
+        <w:rPr>
+          <w:b/>
+        </w:rPr>
+        <w:t xml:space="preserve">Lesson learned: </w:t>
+      </w:r>
+      <w:r>
+        <w:t>Configuration flexibility is useful only when precedence is deterministic and observable.</w:t>
+      </w:r>
+    </w:p>
+    <w:p>
+      <w:pPr>
+        <w:pStyle w:val="Heading2"/>
+      </w:pPr>
+      <w:r>
+        <w:t>TIG-025 - Market platforms combine device clouds, AI agents, visual, accessibility and management, encouraging proprietary coupling.</w:t>
+      </w:r>
+    </w:p>
+    <w:p>
+      <w:r>
+        <w:rPr>
+          <w:b/>
+        </w:rPr>
+        <w:t xml:space="preserve">Area / status: </w:t>
+      </w:r>
+      <w:r>
+        <w:t>Provider lock-in / tool sprawl | ARCHITECTURE DECISION</w:t>
+      </w:r>
+    </w:p>
+    <w:p>
+      <w:r>
+        <w:rPr>
+          <w:b/>
+        </w:rPr>
+        <w:t xml:space="preserve">Root cause: </w:t>
+      </w:r>
+      <w:r>
+        <w:t>Trying to reimplement every commercial cloud would create an expensive, shallow platform.</w:t>
+      </w:r>
+    </w:p>
+    <w:p>
+      <w:r>
+        <w:rPr>
+          <w:b/>
+        </w:rPr>
+        <w:t xml:space="preserve">Solution: </w:t>
+      </w:r>
+      <w:r>
+        <w:t>Position TestigentAI as a provider-neutral quality control plane: Playwright-native core plus remote/device/visual/a11y/evaluator adapters.</w:t>
+      </w:r>
+    </w:p>
+    <w:p>
+      <w:r>
+        <w:rPr>
+          <w:b/>
+        </w:rPr>
+        <w:t xml:space="preserve">Verification: </w:t>
+      </w:r>
+      <w:r>
+        <w:t>Use the competitive benchmark plan and prove portability on local plus at least two providers before claiming an advantage.</w:t>
+      </w:r>
+    </w:p>
+    <w:p>
+      <w:r>
+        <w:rPr>
+          <w:b/>
+        </w:rPr>
+        <w:t xml:space="preserve">Lesson learned: </w:t>
+      </w:r>
+      <w:r>
+        <w:t>Integrate commodity infrastructure; differentiate on governance, portability, data safety and cross-layer evidence.</w:t>
+      </w:r>
+    </w:p>
+    <w:p>
+      <w:pPr>
+        <w:pStyle w:val="Heading2"/>
+      </w:pPr>
+      <w:r>
+        <w:t>TIG-026 - Simple DOM checks could be mistaken for full WCAG compliance.</w:t>
+      </w:r>
+    </w:p>
+    <w:p>
+      <w:r>
+        <w:rPr>
+          <w:b/>
+        </w:rPr>
+        <w:t xml:space="preserve">Area / status: </w:t>
+      </w:r>
+      <w:r>
+        <w:t>Accessibility | RESOLVED V6 / BOUNDED</w:t>
+      </w:r>
+    </w:p>
+    <w:p>
+      <w:r>
+        <w:rPr>
+          <w:b/>
+        </w:rPr>
+        <w:t xml:space="preserve">Root cause: </w:t>
+      </w:r>
+      <w:r>
+        <w:t>Fast checks are valuable but cannot cover semantic/contextual issues, assistive technology or human usability.</w:t>
+      </w:r>
+    </w:p>
+    <w:p>
+      <w:r>
+        <w:rPr>
+          <w:b/>
+        </w:rPr>
+        <w:t xml:space="preserve">Solution: </w:t>
+      </w:r>
+      <w:r>
+        <w:t>Built-in accessibility code is explicitly a PR smoke lane; full conformance must use specialist engine + manual/assistive validation.</w:t>
+      </w:r>
+    </w:p>
+    <w:p>
+      <w:r>
+        <w:rPr>
+          <w:b/>
+        </w:rPr>
+        <w:t xml:space="preserve">Verification: </w:t>
+      </w:r>
+      <w:r>
+        <w:t>Documentation and API names label the feature smoke-level; release notes prohibit conformance claims from it alone.</w:t>
+      </w:r>
+    </w:p>
+    <w:p>
+      <w:r>
+        <w:rPr>
+          <w:b/>
+        </w:rPr>
+        <w:t xml:space="preserve">Lesson learned: </w:t>
+      </w:r>
+      <w:r>
+        <w:t>A trustworthy QA product must state the boundary of automated evidence.</w:t>
+      </w:r>
+    </w:p>
+    <w:p>
+      <w:pPr>
+        <w:pStyle w:val="Heading2"/>
+      </w:pPr>
+      <w:r>
+        <w:t>TIG-027 - Natural-language/YAML authoring can become arbitrary code or shell execution if the DSL is too permissive.</w:t>
+      </w:r>
+    </w:p>
+    <w:p>
+      <w:r>
+        <w:rPr>
+          <w:b/>
+        </w:rPr>
+        <w:t xml:space="preserve">Area / status: </w:t>
+      </w:r>
+      <w:r>
+        <w:t>Declarative authoring security | RESOLVED V6</w:t>
+      </w:r>
+    </w:p>
+    <w:p>
+      <w:r>
+        <w:rPr>
+          <w:b/>
+        </w:rPr>
+        <w:t xml:space="preserve">Root cause: </w:t>
+      </w:r>
+      <w:r>
+        <w:t>Low-code convenience becomes a security boundary once scenario content can invoke unrestricted actions.</w:t>
+      </w:r>
+    </w:p>
+    <w:p>
+      <w:r>
+        <w:rPr>
+          <w:b/>
+        </w:rPr>
+        <w:t xml:space="preserve">Solution: </w:t>
+      </w:r>
+      <w:r>
+        <w:t>Added a strict allowlisted JSON/YAML scenario contract with semantic browser actions only; unknown actions are rejected.</w:t>
+      </w:r>
+    </w:p>
+    <w:p>
+      <w:r>
+        <w:rPr>
+          <w:b/>
+        </w:rPr>
+        <w:t xml:space="preserve">Verification: </w:t>
+      </w:r>
+      <w:r>
+        <w:t>V6 contract test rejects arbitrary shell action and valid sample scenario runs through the governed runner.</w:t>
+      </w:r>
+    </w:p>
+    <w:p>
+      <w:r>
+        <w:rPr>
+          <w:b/>
+        </w:rPr>
+        <w:t xml:space="preserve">Lesson learned: </w:t>
+      </w:r>
+      <w:r>
+        <w:t>Declarative authoring should reduce code, not bypass execution policy.</w:t>
+      </w:r>
+    </w:p>
+    <w:p>
+      <w:pPr>
+        <w:pStyle w:val="Heading2"/>
+      </w:pPr>
+      <w:r>
+        <w:t>TIG-028 - "No tool can compete" is not an engineering fact without comparative evidence.</w:t>
+      </w:r>
+    </w:p>
+    <w:p>
+      <w:r>
+        <w:rPr>
+          <w:b/>
+        </w:rPr>
+        <w:t xml:space="preserve">Area / status: </w:t>
+      </w:r>
+      <w:r>
+        <w:t>Product claims | RESOLVED AS PRODUCT POLICY</w:t>
+      </w:r>
+    </w:p>
+    <w:p>
+      <w:r>
+        <w:rPr>
+          <w:b/>
+        </w:rPr>
+        <w:t xml:space="preserve">Root cause: </w:t>
+      </w:r>
+      <w:r>
+        <w:t>Feature count and vendor marketing cannot establish market leadership.</w:t>
+      </w:r>
+    </w:p>
+    <w:p>
+      <w:r>
+        <w:rPr>
+          <w:b/>
+        </w:rPr>
+        <w:t xml:space="preserve">Solution: </w:t>
+      </w:r>
+      <w:r>
+        <w:t>Added a competitive benchmark plan covering authoring, 100/500/2,000-case scale, collisions, RCA, AI evaluation, portability, security and release reproducibility.</w:t>
+      </w:r>
+    </w:p>
+    <w:p>
+      <w:r>
+        <w:rPr>
+          <w:b/>
+        </w:rPr>
+        <w:t xml:space="preserve">Verification: </w:t>
+      </w:r>
+      <w:r>
+        <w:t>A comparative claim is allowed only after repeatable benchmark evidence across representative applications.</w:t>
+      </w:r>
+    </w:p>
+    <w:p>
+      <w:r>
+        <w:rPr>
+          <w:b/>
+        </w:rPr>
+        <w:t xml:space="preserve">Lesson learned: </w:t>
+      </w:r>
+      <w:r>
+        <w:t>Credibility is a product feature; benchmark before marketing superiority.</w:t>
+      </w:r>
+    </w:p>
+    <w:p>
+      <w:pPr>
+        <w:pStyle w:val="Heading2"/>
+      </w:pPr>
+      <w:r>
+        <w:t>TIG-029 - UI automation alone does not validate RAG/agent reasoning, tools, arguments or task completion.</w:t>
+      </w:r>
+    </w:p>
+    <w:p>
+      <w:r>
+        <w:rPr>
+          <w:b/>
+        </w:rPr>
+        <w:t xml:space="preserve">Area / status: </w:t>
+      </w:r>
+      <w:r>
+        <w:t>AI/agent evaluation | RESOLVED V6 FOUNDATION</w:t>
+      </w:r>
+    </w:p>
+    <w:p>
+      <w:r>
+        <w:rPr>
+          <w:b/>
+        </w:rPr>
+        <w:t xml:space="preserve">Root cause: </w:t>
+      </w:r>
+      <w:r>
+        <w:t>AI applications are non-deterministic and fail at reasoning/action/trajectory layers that browser assertions cannot fully model.</w:t>
+      </w:r>
+    </w:p>
+    <w:p>
+      <w:r>
+        <w:rPr>
+          <w:b/>
+        </w:rPr>
+        <w:t xml:space="preserve">Solution: </w:t>
+      </w:r>
+      <w:r>
+        <w:t>Added a provider-neutral evaluation contract, deterministic hard-gate metrics and bounded concurrency; DeepEval/LangSmith/internal evaluators can plug in as adapters.</w:t>
+      </w:r>
+    </w:p>
+    <w:p>
+      <w:r>
+        <w:rPr>
+          <w:b/>
+        </w:rPr>
+        <w:t xml:space="preserve">Verification: </w:t>
+      </w:r>
+      <w:r>
+        <w:t>Run deterministic exact-output/required-facts contract tests; add external adapters only when organization policy chooses them.</w:t>
+      </w:r>
+    </w:p>
+    <w:p>
+      <w:r>
+        <w:rPr>
+          <w:b/>
+        </w:rPr>
+        <w:t xml:space="preserve">Lesson learned: </w:t>
+      </w:r>
+      <w:r>
+        <w:t>AI testing belongs in the quality platform, but the core should not be locked to one evaluator vendor.</w:t>
+      </w:r>
+    </w:p>
+    <w:p>
+      <w:pPr>
+        <w:pStyle w:val="Heading2"/>
+      </w:pPr>
+      <w:r>
+        <w:t>TIG-030 - Floating latest dependency ranges could change framework behavior between installs.</w:t>
+      </w:r>
+    </w:p>
+    <w:p>
+      <w:r>
+        <w:rPr>
+          <w:b/>
+        </w:rPr>
+        <w:t xml:space="preserve">Area / status: </w:t>
+      </w:r>
+      <w:r>
+        <w:t>Dependency reproducibility | RESOLVED V6</w:t>
+      </w:r>
+    </w:p>
+    <w:p>
+      <w:r>
+        <w:rPr>
+          <w:b/>
+        </w:rPr>
+        <w:t xml:space="preserve">Root cause: </w:t>
+      </w:r>
+      <w:r>
+        <w:t>The lockfile pins an install, but package.json still signaled non-deterministic future resolution and maintenance intent.</w:t>
+      </w:r>
+    </w:p>
+    <w:p>
+      <w:r>
+        <w:rPr>
+          <w:b/>
+        </w:rPr>
+        <w:t xml:space="preserve">Solution: </w:t>
+      </w:r>
+      <w:r>
+        <w:t>Pinned direct dependency ranges to the committed lockfile versions and added a static release check that rejects latest/^/~ ranges.</w:t>
+      </w:r>
+    </w:p>
+    <w:p>
+      <w:r>
+        <w:t>Verification: release:static verifies dependency policy; package-lock/package version is aligned to the current release version.</w:t>
+      </w:r>
+    </w:p>
+    <w:p>
+      <w:r>
+        <w:rPr>
+          <w:b/>
+        </w:rPr>
+        <w:t xml:space="preserve">Lesson learned: </w:t>
+      </w:r>
+      <w:r>
+        <w:t>Reproducibility is a release requirement, not a package-manager detail.</w:t>
+      </w:r>
+    </w:p>
+    <w:p>
+      <w:pPr>
+        <w:pStyle w:val="Heading2"/>
+      </w:pPr>
+      <w:r>
+        <w:t>TIG-031 - CLI Filter Precedence Could Bypass Profile/Lane Governance</w:t>
+      </w:r>
+    </w:p>
+    <w:p>
+      <w:r>
+        <w:t>Area / status: Execution governance | RESOLVED V6 FINAL</w:t>
+      </w:r>
+    </w:p>
+    <w:p>
+      <w:r>
+        <w:t>Root cause: Playwright CLI grep settings can override configuration-level grep/grepInvert. A user-supplied filter could therefore weaken a smoke/lane requirement or replace policy exclusions.</w:t>
+      </w:r>
+    </w:p>
+    <w:p>
+      <w:r>
+        <w:t>Solution: The governed project runner now parses user --grep and --grep-invert flags, ANDs user inclusion filters with mandatory profile/lane groups, and ORs user exclusions with mandatory policy exclusions. Missing/invalid filter values fail fast.</w:t>
+      </w:r>
+    </w:p>
+    <w:p>
+      <w:r>
+        <w:t>Verification: V6 policy contracts verify profile + lane AND semantics; release static/syntax checks cover the runner and policy files.</w:t>
+      </w:r>
+    </w:p>
+    <w:p>
+      <w:r>
+        <w:t>Lesson learned: User flexibility must extend policy safely, not replace governance.</w:t>
+      </w:r>
+    </w:p>
+    <w:p>
+      <w:pPr>
+        <w:pStyle w:val="Heading2"/>
+      </w:pPr>
+      <w:r>
+        <w:t>TIG-032 - Data Ownership Identity Needed Declaration-Time Case Context and Environment Scope</w:t>
+      </w:r>
+    </w:p>
+    <w:p>
+      <w:r>
+        <w:t>Area / status: Parallel data / traceability | RESOLVED V6 FINAL</w:t>
+      </w:r>
+    </w:p>
+    <w:p>
+      <w:r>
+        <w:t>Root cause: A caseId annotation added inside the test body is too late for fixture construction, and an ownership identity without environment/test identity can collide across environments or separate tests that reuse a business case ID.</w:t>
+      </w:r>
+    </w:p>
+    <w:p>
+      <w:r>
+        <w:t>Solution: Data-driven examples declare caseId in Playwright test options before fixture setup. DataScope identities always include unique testId and environment, while preserving stable/attempt/idempotent lifecycle semantics.</w:t>
+      </w:r>
+    </w:p>
+    <w:p>
+      <w:r>
+        <w:t>Verification: Contract tests prove retry behavior, environment separation and different-test separation; scale audit requires caseId annotation when loadCasesSync is used.</w:t>
+      </w:r>
+    </w:p>
+    <w:p>
+      <w:r>
+        <w:t>Lesson learned: Parallel-safe data identity must be established before fixtures start and must include every isolation boundary that can share infrastructure.</w:t>
+      </w:r>
+    </w:p>
+    <w:p>
+      <w:pPr>
+        <w:pStyle w:val="Heading2"/>
+      </w:pPr>
+      <w:r>
+        <w:t>TIG-033 - Duration History Could Accept Invalid Estimates</w:t>
+      </w:r>
+    </w:p>
+    <w:p>
+      <w:r>
+        <w:t>Area / status: Parallel scheduling | RESOLVED V6 FINAL</w:t>
+      </w:r>
+    </w:p>
+    <w:p>
+      <w:r>
+        <w:t>Root cause: History-based scheduling becomes unstable if a persisted or caller-provided estimate is NaN, infinite or negative.</w:t>
+      </w:r>
+    </w:p>
+    <w:p>
+      <w:r>
+        <w:t>Solution: DurationHistoryStore and the duration balancer now validate fallback/history estimates and reject corrupt planning items before shard calculation.</w:t>
+      </w:r>
+    </w:p>
+    <w:p>
+      <w:r>
+        <w:t>Verification: V6 execution/data contract includes invalid-duration rejection plus balanced long-test-first scheduling checks.</w:t>
+      </w:r>
+    </w:p>
+    <w:p>
+      <w:r>
+        <w:t>Lesson learned: Optimization metadata is still production input and needs validation boundaries.</w:t>
+      </w:r>
+    </w:p>
+    <w:p>
+      <w:pPr>
+        <w:pStyle w:val="Heading2"/>
+      </w:pPr>
+      <w:r>
+        <w:t>TIG-034 - Release Evidence Needed to Work Even When the Package Registry Is Unavailable</w:t>
+      </w:r>
+    </w:p>
+    <w:p>
+      <w:r>
+        <w:t>Area / status: Release / supply chain | RESOLVED V6 FINAL</w:t>
+      </w:r>
+    </w:p>
+    <w:p>
+      <w:r>
+        <w:t>Root cause: A dependency-backed verification pipeline alone cannot distinguish source/package defects from a temporary package-registry/network outage.</w:t>
+      </w:r>
+    </w:p>
+    <w:p>
+      <w:r>
+        <w:t>Solution: Added dependency-independent release validation for required artifacts, JSON, pinned dependency policy, local/runtime file hygiene and credential-pattern scanning; added clean full verifier and CycloneDX SBOM generation from the committed lockfile.</w:t>
+      </w:r>
+    </w:p>
+    <w:p>
+      <w:r>
+        <w:t>Verification: Offline verifier passes on the release candidate; full verifier runs npm ci followed by final validation and AI evaluation on a normal networked Node environment.</w:t>
+      </w:r>
+    </w:p>
+    <w:p>
+      <w:r>
+        <w:t>Lesson learned: A release should carry reproducible evidence and should fail transparently at the exact boundary that is unavailable.</w:t>
+      </w:r>
+    </w:p>
+    <w:p>
+      <w:pPr>
+        <w:pStyle w:val="Heading2"/>
+      </w:pPr>
+      <w:r>
+        <w:t>TIG-035 - Clean Verification Exposed Optional-Parameter Type Indexing Defect</w:t>
+      </w:r>
+    </w:p>
+    <w:p>
+      <w:r>
+        <w:t>Area / status: TypeScript / release verification | RESOLVED v1.1.1</w:t>
+      </w:r>
+    </w:p>
+    <w:p>
+      <w:r>
+        <w:t>Root cause: scripts/test-project.ts indexed Parameters&lt;typeof resolveExecutionPolicy&gt;[0]['profile']. Because resolveExecutionPolicy has a defaulted optional input, TypeScript correctly models parameter zero as ExecutionPolicyInput | undefined, so direct property indexing is invalid under clean strict compilation.</w:t>
+      </w:r>
+    </w:p>
+    <w:p>
+      <w:r>
+        <w:t>Solution: ProjectPreflight.profile and resolveRunnerPolicy now use the explicit reusable ExecutionProfileName contract directly. The unsafe Parameters&lt;...&gt; cast was removed instead of suppressing the compiler.</w:t>
+      </w:r>
+    </w:p>
+    <w:p>
+      <w:r>
+        <w:t>Verification: VERIFY_RELEASE.sh reached the mandatory typecheck gate after a clean npm ci and exposed TS2339. The hotfix keeps typecheck as a blocking release gate and requires a fresh rerun before promotion.</w:t>
+      </w:r>
+    </w:p>
+    <w:p>
+      <w:r>
+        <w:t>Lesson learned: Dependency-independent source checks are valuable but cannot replace a clean dependency-backed TypeScript compile. Release qualification must include both layers.</w:t>
+      </w:r>
+    </w:p>
+    <w:p>
+      <w:pPr>
+        <w:pStyle w:val="Heading2"/>
+      </w:pPr>
+      <w:r>
+        <w:t>TIG-036 - Comment Audit CLI Alias and Pure-Data Lane Warning</w:t>
+      </w:r>
+    </w:p>
+    <w:p>
+      <w:r>
+        <w:t>Area / status: CLI usability / scale audit | RESOLVED v1.1.2</w:t>
+      </w:r>
+    </w:p>
+    <w:p>
+      <w:r>
+        <w:t>Root cause: The canonical reusable-comment check was exposed only as docs:comment-audit, so the intuitive comments:audit command failed with npm Missing script. Separately, the scale audit required an external execution-lane tag on every project spec even when a spec was intentionally a pure data-contract test already classified with @data.</w:t>
+      </w:r>
+    </w:p>
+    <w:p>
+      <w:r>
+        <w:t>Solution: Added comments:audit as a compatibility alias to docs:comment-audit and made the static release gate enforce that alias. Scale audit now accepts @data as a valid pure-data classification while continuing to require explicit lanes for tests that exercise external execution capabilities.</w:t>
+      </w:r>
+    </w:p>
+    <w:p>
+      <w:r>
+        <w:t>Verification: release:static confirms the alias contract. Running npm run comments:audit resolves to docs:comment-audit after dependency installation, and scale:audit reports no lane warning for projects/demo/tests/data/data.factory.spec.ts because it is intentionally tagged @data.</w:t>
+      </w:r>
+    </w:p>
+    <w:p>
+      <w:r>
+        <w:t>Lesson learned: Product CLI ergonomics and audit semantics are part of framework quality. A warning should identify real architecture debt, not force misleading metadata merely to make a checker quiet.</w:t>
       </w:r>
     </w:p>
     <w:sectPr>

</xml_diff>

<commit_message>
feat: add schema-driven declarative YAML authoring
</commit_message>
<xml_diff>
--- a/docs/TestigentAI_Issue_Challenge_Solution_Log.docx
+++ b/docs/TestigentAI_Issue_Challenge_Solution_Log.docx
@@ -7600,6 +7600,39 @@
         <w:t>Lesson learned: Product CLI ergonomics and audit semantics are part of framework quality. A warning should identify real architecture debt, not force misleading metadata merely to make a checker quiet.</w:t>
       </w:r>
     </w:p>
+    <w:p>
+      <w:pPr>
+        <w:pStyle w:val="Heading2"/>
+      </w:pPr>
+      <w:r>
+        <w:t>TIG-037 - Declarative YAML Was Executable but Not Self-Discoverable for Authors</w:t>
+      </w:r>
+    </w:p>
+    <w:p>
+      <w:r>
+        <w:t>Area / status: Declarative authoring / product UX / governance | RESOLVED v1.2.0</w:t>
+      </w:r>
+    </w:p>
+    <w:p>
+      <w:r>
+        <w:t>Root cause: The first declarative layer could execute a constrained YAML scenario, but authors had to know the DSL by reading source or copying an example. There was no authoritative capability guide, IDE schema/autocomplete, scaffold command, preflight validator, duplicate-ID guard, or explicit rule for when a scenario should move to TypeScript. A related routing ambiguity also allowed app base URLs with a path to be escaped by url: /.</w:t>
+      </w:r>
+    </w:p>
+    <w:p>
+      <w:r>
+        <w:t>Solution: Added a versioned Zod runtime contract, deterministic Draft 2020-12 editor schema, VS Code YAML association, scenario help/list/new/validate/run/doctor commands, recursive project discovery, one-scenario-per-Playwright-test declaration, step-level reporting, shared capability drift checks, app-root-aware navigation, and cross-origin deny-by-default governance. Complex control flow and cross-layer orchestration remain code-first TypeScript concerns.</w:t>
+      </w:r>
+    </w:p>
+    <w:p>
+      <w:r>
+        <w:t>Verification: Release/static and offline gates require the authoring artifacts; schema-builder drift is checked; declarative authoring contract tests cover valid/invalid scenarios, navigation semantics, cross-origin blocking and catalog/schema alignment; scenario:doctor is part of validate:final. Deep research and the user guide are included in docs/23 and docs/24.</w:t>
+      </w:r>
+    </w:p>
+    <w:p>
+      <w:r>
+        <w:t>Lesson learned: A low-code engine is not a product feature until users can discover its boundaries, receive authoring feedback before execution, and know when to switch to code. The DSL should optimize clarity and governance rather than grow into an unbounded second programming language.</w:t>
+      </w:r>
+    </w:p>
     <w:sectPr>
       <w:headerReference w:type="default" r:id="rId9"/>
       <w:footerReference w:type="default" r:id="rId10"/>

</xml_diff>